<commit_message>
Paper 1 fifth review round: launch-sequencing, one word of product truth
Round 5 (3 fresh reviewers): 1 required COI fix + 2 required copy fixes +
1 fact-check landmine; fact-check otherwise NO REQUIRED DEFECTS with all
spot-checks passing.
- Scoping-before-launch no longer condemns the disclosed product: 'or, for
  tools already in clinical use, be obtained without delay'
- 'commercial use' -> 'commercial release' (0 paid subs; MSCC not yet live
  - never assert adoption the records do not show)
- 'condition-general' -> 'product-independent' (4.1's PEM screening made
  the old word contradictory); cover-letter comma placement + valediction;
  aged 13-18; three hedges (rarely-captured -> workflows-not-set-up-to-
  capture; main->major threat; established->familiar pattern)

Co-Authored-By: Claude Fable 5 <noreply@anthropic.com>
</commit_message>
<xml_diff>
--- a/docs/sst-publications/01-clinical-review-SUBMISSION.docx
+++ b/docs/sst-publications/01-clinical-review-SUBMISSION.docx
@@ -136,7 +136,7 @@
         </w:numPr>
       </w:pPr>
       <w:r>
-        <w:t xml:space="preserve">Between-visit delivery typically goes unobserved: the data that make the prescription safe to progress — live heart rate against the prescribed band, completed-session records, next-day symptom responses, and serial thresholds — are rarely captured in routine records.</w:t>
+        <w:t xml:space="preserve">Between-visit delivery typically goes unobserved: the data that make the prescription safe to progress — live heart rate against the prescribed band, completed-session records, next-day symptom responses, and serial thresholds — are data that ordinary clinical workflows are not set up to capture.</w:t>
       </w:r>
     </w:p>
     <w:p>
@@ -288,7 +288,7 @@
         <w:t xml:space="preserve"> </w:t>
       </w:r>
       <w:r>
-        <w:t xml:space="preserve">The author developed the SST Trainer software, which appears in Section 4.2 as one disclosed instance of the delivery requirements — not as the review’s conclusion. To limit advocacy bias: the clinical evidence (Sections 1–3) is presented independently of any product; the delivery requirements (Section 4) are stated as condition-general design principles before any tool is named in the review’s argument (this disclosure excepted); existing tools, including the author’s, are then located against those principles with the interest disclosed (Section 4.2); and no efficacy claim is made for the author’s software.</w:t>
+        <w:t xml:space="preserve">The author developed the SST Trainer software, which appears in Section 4.2 as one disclosed instance of the delivery requirements — not as the review’s conclusion. To limit advocacy bias: the clinical evidence (Sections 1–3) is presented independently of any product; the delivery requirements (Section 4) are stated as product-independent design principles before any tool is named in the review’s argument (this disclosure excepted); existing tools, including the author’s, are then located against those principles with the interest disclosed (Section 4.2); and no efficacy claim is made for the author’s software.</w:t>
       </w:r>
     </w:p>
     <w:bookmarkEnd w:id="11"/>
@@ -698,7 +698,7 @@
         <w:t xml:space="preserve"> </w:t>
       </w:r>
       <w:r>
-        <w:t xml:space="preserve">In a randomised clinical trial of 103 adolescents (ages 13–18) in the acute phase of sport-related concussion, sub-symptom-threshold aerobic exercise versus a placebo-like stretching programme accelerated recovery: median recovery 13 days versus 17 days, a statistically significant difference [9].</w:t>
+        <w:t xml:space="preserve">In a randomised clinical trial of 103 adolescents (aged 13–18) in the acute phase of sport-related concussion, sub-symptom-threshold aerobic exercise versus a placebo-like stretching programme accelerated recovery: median recovery 13 days versus 17 days, a statistically significant difference [9].</w:t>
       </w:r>
     </w:p>
     <w:p>
@@ -1089,7 +1089,7 @@
         <w:t xml:space="preserve"> </w:t>
       </w:r>
       <w:r>
-        <w:t xml:space="preserve">Friction is the main threat to adherence. A tool should accept any wearable that broadcasts the standard Bluetooth Heart Rate profile — chest straps and most sports watches — and should fall back to clinician manual entry, meeting the patient where they are rather than mandating a purchase. Heart rate is the load-bearing measurement; sourcing it must never be the blocker. Two honest limits attach to any implementation: phone-camera photoplethysmography is unreliable during exercise because of motion artefact, so it should never drive a live training session; and some widely owned wrist devices do not broadcast the standard Bluetooth Heart Rate profile, so those users need a chest strap or manual entry.</w:t>
+        <w:t xml:space="preserve">Friction is a major threat to adherence. A tool should accept any wearable that broadcasts the standard Bluetooth Heart Rate profile — chest straps and most sports watches — and should fall back to clinician manual entry, meeting the patient where they are rather than mandating a purchase. Heart rate is the load-bearing measurement; sourcing it must never be the blocker. Two honest limits attach to any implementation: phone-camera photoplethysmography is unreliable during exercise because of motion artefact, so it should never drive a live training session; and some widely owned wrist devices do not broadcast the standard Bluetooth Heart Rate profile, so those users need a chest strap or manual entry.</w:t>
       </w:r>
     </w:p>
     <w:p>
@@ -1185,7 +1185,7 @@
         <w:t xml:space="preserve"> </w:t>
       </w:r>
       <w:r>
-        <w:t xml:space="preserve">A delivery tool of this kind should be a clinician-directed assistant, not a consumer self-diagnosis product: the qualified clinician runs or oversees the threshold test, interprets it, sets the heart-rate band, owns the prescription, approves progression, and clears return to activity; the software executes, paces, monitors, and records. It informs; it never decides. Even so, software that analyses a live physiological signal and is operated by the patient may fall outside clinical-decision-support carve-outs — such as the carve-out under the US 21st Century Cures Act §3060 and the TGA’s clinical-decision-support exclusion, both drafted around clinician-facing software that does not process device signals — and be regulated as software as a medical device. Classification turns on claims and intended use, and a formal regulatory scoping opinion should precede any launch.</w:t>
+        <w:t xml:space="preserve">A delivery tool of this kind should be a clinician-directed assistant, not a consumer self-diagnosis product: the qualified clinician runs or oversees the threshold test, interprets it, sets the heart-rate band, owns the prescription, approves progression, and clears return to activity; the software executes, paces, monitors, and records. It informs; it never decides. Even so, software that analyses a live physiological signal and is operated by the patient may fall outside clinical-decision-support carve-outs — such as the carve-out under the US 21st Century Cures Act §3060 and the TGA’s clinical-decision-support exclusion, both drafted around clinician-facing software that does not process device signals — and be regulated as software as a medical device. Classification turns on claims and intended use, and a formal regulatory scoping opinion should precede launch — or, for tools already in clinical use, be obtained without delay.</w:t>
       </w:r>
     </w:p>
     <w:bookmarkStart w:id="23" w:name="why-active-and-not-pacing"/>
@@ -1330,7 +1330,7 @@
         <w:t xml:space="preserve"> </w:t>
       </w:r>
       <w:r>
-        <w:t xml:space="preserve">platforms (e.g. Sway [21]) digitise symptom, balance and cognitive testing; their published descriptions include no exertion- or heart-rate-guided therapy. Supervised heart-rate-zone training is an established pattern in app-based cardiac rehabilitation; this review’s mapping identified no equivalently supervised, at-scale commercial implementation for concussion.</w:t>
+        <w:t xml:space="preserve">platforms (e.g. Sway [21]) digitise symptom, balance and cognitive testing; their published descriptions include no exertion- or heart-rate-guided therapy. Supervised heart-rate-zone training is a familiar pattern in app-based cardiac rehabilitation; this review’s mapping identified no equivalently supervised, at-scale commercial implementation for concussion.</w:t>
       </w:r>
     </w:p>
     <w:p>
@@ -1403,7 +1403,7 @@
         <w:pStyle w:val="BodyText"/>
       </w:pPr>
       <w:r>
-        <w:t xml:space="preserve">The author’s software (SST Trainer, developed by Concussion Education Australia — the competing interest disclosed in the Methods and Declarations) is one attempt to implement the Section 4 requirements as stated. Whether it achieves that combination in practice is a product claim this review does not adjudicate; it is asserted here only as design intent. The software is in early, clinician-gated commercial use in Australia, and the regulatory scoping recommended above applies to it no less than to any other tool in the category. It is named for transparency and located against the same criteria as its comparators; consistent with Section 5, no efficacy claim is made for it.</w:t>
+        <w:t xml:space="preserve">The author’s software (SST Trainer, developed by Concussion Education Australia — the competing interest disclosed in the Methods and Declarations) is one attempt to implement the Section 4 requirements as stated. Whether it achieves that combination in practice is a product claim this review does not adjudicate; it is asserted here only as design intent. The software is in early, clinician-gated commercial release in Australia, and the regulatory scoping recommended above applies to it no less than to any other tool in the category. It is named for transparency and located against the same criteria as its comparators; consistent with Section 5, no efficacy claim is made for it.</w:t>
       </w:r>
     </w:p>
     <w:bookmarkEnd w:id="24"/>

</xml_diff>

<commit_message>
Paper 1 seventh review round: every bare empirical claim now carries a verified citation
Round 7: copy-edit clean but stale word count; hostile reduced to one
required class (uncited empirical assertions). Five references added, all
verified against PubMed/publisher pages before insertion, list renumbered
1-27 with a scripted token map + order/orphan audit:
- Thomas 2015 Pediatrics (strict-rest RCT: higher symptom burden) now
  anchors the harms-of-rest paragraph
- Coppetti 2017 EJPC (smartphone HR apps) + Gillinov 2017 MSSE (wrist
  optical accuracy during exercise) anchor the no-camera-PPG rule and the
  Section 5 sensor-accuracy limitation
- Varnfield 2014 Heart anchors the cardiac-rehab analogy; Eysenbach 2005
  JMIR (law of attrition) anchors adherence decay
- Stone claim hedged to analogous self-report settings; proven->established
  (Balke safety); Declarations/title-page dangling which reordered; word
  count refreshed

Co-Authored-By: Claude Fable 5 <noreply@anthropic.com>
</commit_message>
<xml_diff>
--- a/docs/sst-publications/01-clinical-review-SUBMISSION.docx
+++ b/docs/sst-publications/01-clinical-review-SUBMISSION.docx
@@ -102,7 +102,7 @@
         <w:pStyle w:val="FirstParagraph"/>
       </w:pPr>
       <w:r>
-        <w:t xml:space="preserve">For two decades the default management of concussion was rest until symptom-free. A coherent body of physiological and randomised-trial evidence has overturned that doctrine. Concussion produces a measurable, exercise-provocable autonomic phenotype — exercise intolerance — that can be quantified with a standardised graded treadmill test (the Buffalo Concussion Treadmill Test, BCTT) to a heart-rate threshold (HRt) at which symptoms are reproducibly exacerbated. Prescribing aerobic exercise just below that threshold (sub-symptom-threshold aerobic exercise, SSTAE) accelerated recovery in a randomised controlled trial of adolescents and, in a subsequent multicentre randomised trial, roughly halved the incidence of persistent post-concussive symptoms; the approach is now endorsed by the 6th International Consensus Statement on Concussion in Sport (Amsterdam 2022/2023). Yet the prescription remains hard to deliver: it depends on an individualised heart-rate ceiling that must be respected on every between-visit session, in the patient’s own time, away from the clinic and the treadmill. This review traces the paradigm shift, summarises the threshold-test and SSTAE evidence with effect sizes where published, and names the implementation gap between an evidence-based prescription and faithful between-visit delivery. It then proposes a set of delivery requirements, framed by the author and informed by the trial procedures and the delivery-gap analysis: a live, verified heart-rate signal displayed against the prescribed band; hardware-agnostic sourcing of that signal; refusal to fabricate readings; progression gated on verified sessions; and structured reporting back to the prescribing clinician. Existing tools, including one developed by the author (a disclosed competing interest), are located against those requirements. The defensible contribution of such tools is faithful, verifiable delivery of an established treatment: not new physiology, and not the first digital delivery.</w:t>
+        <w:t xml:space="preserve">For two decades the default management of concussion was rest until symptom-free. A coherent body of physiological and randomised-trial evidence has overturned that doctrine. Concussion produces a measurable, exercise-provocable autonomic phenotype — exercise intolerance — that can be quantified with a standardised graded treadmill test (the Buffalo Concussion Treadmill Test, BCTT) to a heart-rate threshold (HRt) at which symptoms are reproducibly exacerbated. Prescribing aerobic exercise just below that threshold (sub-symptom-threshold aerobic exercise, SSTAE) accelerated recovery in a randomised controlled trial in adolescents and, in a subsequent multicentre randomised trial, roughly halved the incidence of persistent post-concussive symptoms; the approach is now endorsed by the 6th International Consensus Statement on Concussion in Sport (Amsterdam 2022/2023). Yet the prescription remains hard to deliver: it depends on an individualised heart-rate ceiling that must be respected on every between-visit session, in the patient’s own time, away from the clinic and the treadmill. This review traces the paradigm shift, summarises the threshold-test and SSTAE evidence with effect sizes where published, and names the implementation gap between an evidence-based prescription and faithful between-visit delivery. It then proposes a set of delivery requirements, framed by the author and informed by the trial procedures and the delivery-gap analysis: a live, verified heart-rate signal displayed against the prescribed band; hardware-agnostic sourcing of that signal; refusal to fabricate readings; progression gated on verified sessions; and structured reporting back to the prescribing clinician. Existing tools, including one developed by the author (a disclosed competing interest), are located against those requirements. The defensible contribution of such tools is faithful, verifiable delivery of an established treatment: not new physiology, and not the first digital delivery.</w:t>
       </w:r>
     </w:p>
     <w:bookmarkEnd w:id="9"/>
@@ -340,7 +340,7 @@
         <w:t xml:space="preserve">“cocoon therapy”</w:t>
       </w:r>
       <w:r>
-        <w:t xml:space="preserve">. The intuition was mechanical: an injured brain should be protected from load. But prolonged rest has costs. Deconditioning, sleep disruption, mood disturbance, social isolation and nocebo-style symptom focus all compound the original injury, and there was never randomised evidence that strict rest shortened recovery. By the mid-2010s, the rest prescription was being actively questioned.</w:t>
+        <w:t xml:space="preserve">. The intuition was mechanical: an injured brain should be protected from load. But prolonged rest has costs. Deconditioning, sleep disruption, mood disturbance, social isolation and nocebo-style symptom focus all compound the original injury, and there was never randomised evidence that strict rest shortened recovery; the one randomised trial of strict rest found a higher symptom burden and slower symptom resolution than usual care [1]. By the mid-2010s, the rest prescription was being actively questioned.</w:t>
       </w:r>
     </w:p>
     <w:p>
@@ -364,7 +364,7 @@
         <w:t xml:space="preserve"> </w:t>
       </w:r>
       <w:r>
-        <w:t xml:space="preserve">[1]. The argument is that a meaningful proportion of post-concussion symptom burden is not structural but a disorder of physiological regulation — autonomic and cerebrovascular dysregulation that is provoked by exertion and, crucially, is responsive to a graded aerobic stimulus delivered below the provocation threshold. Exercise, correctly dosed, is not a risk to be avoided; it is the treatment.</w:t>
+        <w:t xml:space="preserve">[2]. The argument is that a meaningful proportion of post-concussion symptom burden is not structural but a disorder of physiological regulation — autonomic and cerebrovascular dysregulation that is provoked by exertion and, crucially, is responsive to a graded aerobic stimulus delivered below the provocation threshold. Exercise, correctly dosed, is not a risk to be avoided; it is the treatment.</w:t>
       </w:r>
     </w:p>
     <w:bookmarkEnd w:id="12"/>
@@ -395,7 +395,7 @@
         <w:t xml:space="preserve">exercise intolerance</w:t>
       </w:r>
       <w:r>
-        <w:t xml:space="preserve">: a reproducible exacerbation of concussion symptoms at a sub-maximal level of exertion that would be unremarkable in a healthy person. Mechanistically it is attributed to autonomic nervous system dysfunction and impaired cerebral autoregulation after the injury [2]. Exercise intolerance is common and clinically meaningful: in one exploratory cohort of 100 adults with persistent post-concussive symptoms, over 80% tested positive for exercise intolerance, and a higher symptom burden was associated with higher odds of testing positive [3]. This matters because it means the phenotype is (a) apparently common, (b) measurable, and (c) the direct target of the treatment.</w:t>
+        <w:t xml:space="preserve">: a reproducible exacerbation of concussion symptoms at a sub-maximal level of exertion that would be unremarkable in a healthy person. Mechanistically it is attributed to autonomic nervous system dysfunction and impaired cerebral autoregulation after the injury [3]. Exercise intolerance is common and clinically meaningful: in one exploratory cohort of 100 adults with persistent post-concussive symptoms, over 80% tested positive for exercise intolerance, and a higher symptom burden was associated with higher odds of testing positive [4]. This matters because it means the phenotype is (a) apparently common, (b) measurable, and (c) the direct target of the treatment.</w:t>
       </w:r>
     </w:p>
     <w:bookmarkEnd w:id="13"/>
@@ -413,7 +413,7 @@
         <w:pStyle w:val="FirstParagraph"/>
       </w:pPr>
       <w:r>
-        <w:t xml:space="preserve">The 6th International Consensus Statement on Concussion in Sport [4] codified the shift. Its position can be summarised:</w:t>
+        <w:t xml:space="preserve">The 6th International Consensus Statement on Concussion in Sport [5] codified the shift. Its position can be summarised:</w:t>
       </w:r>
     </w:p>
     <w:p>
@@ -457,7 +457,7 @@
         <w:t xml:space="preserve"> </w:t>
       </w:r>
       <w:r>
-        <w:t xml:space="preserve">Sub-symptom-threshold aerobic exercise initiated within roughly 2–10 days of injury is recommended; it reduces the incidence of persisting symptoms and facilitates recovery, including in those whose symptoms already exceed a month.</w:t>
+        <w:t xml:space="preserve">Sub-symptom-threshold aerobic exercise initiated within roughly 2–10 days of injury is recommended; it reduces the incidence of persisting symptoms and facilitates recovery, including in those whose symptoms have already persisted beyond a month.</w:t>
       </w:r>
     </w:p>
     <w:p>
@@ -515,7 +515,7 @@
         <w:pStyle w:val="FirstParagraph"/>
       </w:pPr>
       <w:r>
-        <w:t xml:space="preserve">The instrument that operationalised exercise intolerance is the BCTT, a standardised graded treadmill test built on the cardiac Balke protocol [5]. The protocol — walk at a fixed starting speed, then increase the incline by 1° each minute for 15 stages, after which the speed increases — was chosen precisely because the Balke ramp is gentle, well-validated and proven safe even in cardiac patients. Heart rate, rating of perceived exertion (Borg RPE) and a symptom-severity score are recorded every minute.</w:t>
+        <w:t xml:space="preserve">The instrument that operationalised exercise intolerance is the BCTT, a standardised graded treadmill test built on the cardiac Balke protocol [6]. The protocol — walk at a fixed starting speed, then increase the incline by 1° each minute for 15 stages, after which the speed increases — was chosen precisely because the Balke ramp is gentle, well-validated and established as safe even in cardiac patients. Heart rate, rating of perceived exertion (Borg RPE) and a symptom-severity score are recorded every minute.</w:t>
       </w:r>
     </w:p>
     <w:p>
@@ -626,7 +626,7 @@
         <w:pStyle w:val="FirstParagraph"/>
       </w:pPr>
       <w:r>
-        <w:t xml:space="preserve">The BCTT is reliable as a repeated measure [6], which is what justifies serial testing as a recovery curve.</w:t>
+        <w:t xml:space="preserve">The BCTT is reliable as a repeated measure [7], which is what justifies serial testing as a recovery curve.</w:t>
       </w:r>
     </w:p>
     <w:bookmarkEnd w:id="16"/>
@@ -644,7 +644,7 @@
         <w:pStyle w:val="FirstParagraph"/>
       </w:pPr>
       <w:r>
-        <w:t xml:space="preserve">Beyond prescribing, the threshold test forecasts recovery. In adolescents with sport-related concussion, an absolute HRt below ~135 bpm was associated with prolonged (&gt;21-day) recovery in an earlier cohort from the same group (as cited in [7]), and Haider and colleagues found that a blunted heart-rate response — a change in heart rate of ≤50 bpm across the test — predicted delayed (&gt;30-day) recovery with roughly 73% sensitivity and 78% specificity in adolescents not treated with aerobic exercise (the rest and placebo-stretching arms) [7]. A single test that both prescribes the dose and stratifies recovery risk is clinically valuable — and serial HRt becomes an objective recovery trajectory rather than a subjective symptom diary.</w:t>
+        <w:t xml:space="preserve">Beyond prescribing, the threshold test forecasts recovery. In adolescents with sport-related concussion, an absolute HRt below ~135 bpm was associated with prolonged (&gt;21-day) recovery in an earlier cohort from the same group (as cited in [8]), and Haider and colleagues found that a blunted heart-rate response — a change in heart rate of ≤50 bpm across the test — predicted delayed (&gt;30-day) recovery with roughly 73% sensitivity and 78% specificity in adolescents not treated with aerobic exercise (the rest and placebo-stretching arms) [8]. A single test that both prescribes the dose and stratifies recovery risk is clinically valuable — and serial HRt becomes an objective recovery trajectory rather than a subjective symptom diary.</w:t>
       </w:r>
     </w:p>
     <w:bookmarkEnd w:id="17"/>
@@ -680,7 +680,7 @@
         <w:t xml:space="preserve"> </w:t>
       </w:r>
       <w:r>
-        <w:t xml:space="preserve">A preliminary sub-symptom-threshold treadmill-training programme for refractory post-concussion syndrome demonstrated feasibility and symptom improvement when patients exercised most days at ~80% of their symptom-threshold heart rate [8].</w:t>
+        <w:t xml:space="preserve">A preliminary sub-symptom-threshold treadmill-training programme for refractory post-concussion syndrome demonstrated feasibility and symptom improvement when patients exercised most days at ~80% of their symptom-threshold heart rate [9].</w:t>
       </w:r>
     </w:p>
     <w:p>
@@ -698,7 +698,7 @@
         <w:t xml:space="preserve"> </w:t>
       </w:r>
       <w:r>
-        <w:t xml:space="preserve">In a randomised clinical trial of 103 adolescents (aged 13–18) in the acute phase of sport-related concussion, sub-symptom-threshold aerobic exercise versus a placebo-like stretching programme accelerated recovery: median recovery 13 days versus 17 days, a statistically significant difference [9].</w:t>
+        <w:t xml:space="preserve">In a randomised clinical trial of 103 adolescents (aged 13–18) in the acute phase of sport-related concussion, sub-symptom-threshold aerobic exercise versus a placebo-like stretching programme accelerated recovery: median recovery 13 days versus 17 days, a statistically significant difference [10].</w:t>
       </w:r>
     </w:p>
     <w:p>
@@ -716,7 +716,7 @@
         <w:t xml:space="preserve"> </w:t>
       </w:r>
       <w:r>
-        <w:t xml:space="preserve">A larger, three-site RCT of 118 adolescents presenting within 10 days of injury, led by the originating group with collaborating sites, reproduced and extended the finding: targeted-heart-rate sub-symptom-threshold aerobic exercise roughly halved the risk of persistent post-concussive symptoms (hazard ratio for stretching versus aerobic exercise 0.52, 95% CI 0.28–0.97, p=0.039) and shortened recovery, with good adherence and no adverse events [10]. Extension across multiple sites, with prevention of</w:t>
+        <w:t xml:space="preserve">A larger, three-site RCT of 118 adolescents presenting within 10 days of injury, led by the originating group with collaborating sites, reproduced and extended the finding: targeted-heart-rate sub-symptom-threshold aerobic exercise roughly halved the risk of persistent post-concussive symptoms (hazard ratio for stretching versus aerobic exercise 0.52, 95% CI 0.28–0.97, p=0.039) and shortened recovery, with good adherence and no adverse events [11]. Extension across multiple sites, with prevention of</w:t>
       </w:r>
       <w:r>
         <w:t xml:space="preserve"> </w:t>
@@ -750,7 +750,7 @@
         <w:t xml:space="preserve"> </w:t>
       </w:r>
       <w:r>
-        <w:t xml:space="preserve">A comparison of rest versus aerobic exercise versus placebo-like treatment in male and female adolescents further supported active over rest management [11]. Systematic synthesis for the Amsterdam process concluded that early rest beyond 24–48 hours confers no benefit and that prescribed sub-symptom-threshold aerobic exercise is beneficial [12]. A separate review noted that, while the adolescent evidence is strong, good-quality trials in adults and on broader outcomes are still needed [13].</w:t>
+        <w:t xml:space="preserve">A comparison of rest versus aerobic exercise versus placebo-like treatment in male and female adolescents further supported active over rest management [12]. Systematic synthesis for the Amsterdam process concluded that early rest beyond 24–48 hours confers no benefit and that prescribed sub-symptom-threshold aerobic exercise is beneficial [13]. A separate review noted that, while the adolescent evidence is strong, good-quality trials in adults and on broader outcomes are still needed [14].</w:t>
       </w:r>
     </w:p>
     <w:bookmarkEnd w:id="18"/>
@@ -768,7 +768,7 @@
         <w:pStyle w:val="FirstParagraph"/>
       </w:pPr>
       <w:r>
-        <w:t xml:space="preserve">A practical obstacle is that not every clinician has a treadmill, a heart-rate monitor and the time to run a staged treadmill test with per-minute logging. The Buffalo group addressed this in two practical-management papers: one detailing how to prescribe SSTAE in the outpatient setting from an HRt [14], and one giving a standardised programme in the absence of graded exercise testing [15]. Together they establish that the prescription — a heart-rate-anchored band, ~20 minutes, most days, with a within-session symptom-stop rule and graded progression — is meant to be portable and repeatable.</w:t>
+        <w:t xml:space="preserve">A practical obstacle is that not every clinician has a treadmill, a heart-rate monitor and the time to run a staged treadmill test with per-minute logging. The Buffalo group addressed this in two practical-management papers: one detailing how to prescribe SSTAE in the outpatient setting from an HRt [15], and one giving a standardised programme in the absence of graded exercise testing [16]. Together they establish that the prescription — a heart-rate-anchored band, ~20 minutes, most days, with a within-session symptom-stop rule and graded progression — is meant to be portable and repeatable.</w:t>
       </w:r>
     </w:p>
     <w:bookmarkEnd w:id="19"/>
@@ -820,7 +820,7 @@
         <w:t xml:space="preserve"> </w:t>
       </w:r>
       <w:r>
-        <w:t xml:space="preserve">HRt from a symptom-limited graded test (the validated provocation criterion is a symptom rise of ≥3 points from rest) [5].</w:t>
+        <w:t xml:space="preserve">HRt from a symptom-limited graded test (the validated provocation criterion is a symptom rise of ≥3 points from rest) [6].</w:t>
       </w:r>
     </w:p>
     <w:p>
@@ -842,7 +842,7 @@
         <w:t xml:space="preserve"> </w:t>
       </w:r>
       <w:r>
-        <w:t xml:space="preserve">train at ~80–90% of HRt for concussion — a floor intended to preserve a training stimulus and a do-not-exceed ceiling that keeps the patient below provocation [8–10,13].</w:t>
+        <w:t xml:space="preserve">train at ~80–90% of HRt for concussion — a floor intended to preserve a training stimulus and a do-not-exceed ceiling that keeps the patient below provocation [9–11,14].</w:t>
       </w:r>
     </w:p>
     <w:p>
@@ -864,7 +864,7 @@
         <w:t xml:space="preserve"> </w:t>
       </w:r>
       <w:r>
-        <w:t xml:space="preserve">~20 minutes, most days of the week [9,10].</w:t>
+        <w:t xml:space="preserve">~20 minutes, most days of the week [10,11].</w:t>
       </w:r>
     </w:p>
     <w:p>
@@ -886,7 +886,7 @@
         <w:t xml:space="preserve"> </w:t>
       </w:r>
       <w:r>
-        <w:t xml:space="preserve">stop if symptoms rise more than 2 points above pre-session — the complement of the consensus’s up-to-2-point tolerance band [4].</w:t>
+        <w:t xml:space="preserve">stop if symptoms rise more than 2 points above pre-session — the complement of the consensus’s up-to-2-point tolerance band [5].</w:t>
       </w:r>
     </w:p>
     <w:p>
@@ -908,7 +908,7 @@
         <w:t xml:space="preserve"> </w:t>
       </w:r>
       <w:r>
-        <w:t xml:space="preserve">advance the ceiling only after clean sessions (no within-session provocation, no next-day flare); regress on repeated provocation; re-test HRt to update precisely [14,15]. Serial HRt is the recovery curve; a re-test that no longer provokes symptoms is a key input to the return-to-activity decision.</w:t>
+        <w:t xml:space="preserve">advance the ceiling only after clean sessions (no within-session provocation, no next-day flare); regress on repeated provocation; re-test HRt to update precisely [15,16]. Serial HRt is the recovery curve; a re-test that no longer provokes symptoms is a key input to the return-to-activity decision.</w:t>
       </w:r>
     </w:p>
     <w:bookmarkEnd w:id="20"/>
@@ -927,7 +927,7 @@
         <w:pStyle w:val="FirstParagraph"/>
       </w:pPr>
       <w:r>
-        <w:t xml:space="preserve">Here is the problem the evidence does not solve. The trials prescribed an individualised heart-rate ceiling and reported good adherence under clinician oversight [9,10]. In routine practice, three things break:</w:t>
+        <w:t xml:space="preserve">Here is the problem the evidence does not solve. The trials prescribed an individualised heart-rate ceiling and reported good adherence under clinician oversight [10,11]. In routine practice, three things break:</w:t>
       </w:r>
     </w:p>
     <w:p>
@@ -954,7 +954,7 @@
         <w:t xml:space="preserve"> </w:t>
       </w:r>
       <w:r>
-        <w:t xml:space="preserve">is not something a patient can feel. Without a live read on heart rate, the patient is guessing — and the two failure modes are opposite and both harmful: under-dosing (no therapeutic stimulus, slow recovery) or over-shooting the ceiling (symptom provocation, a flare, loss of confidence in active rehabilitation).</w:t>
+        <w:t xml:space="preserve">is not something a patient can feel. Without a live read on heart rate, the patient is guessing — and the two failure modes are opposite and both harmful: under-dosing (no therapeutic stimulus, slow recovery) or overshooting the ceiling (symptom provocation, a flare, loss of confidence in active rehabilitation).</w:t>
       </w:r>
     </w:p>
     <w:p>
@@ -996,7 +996,7 @@
         <w:t xml:space="preserve"> </w:t>
       </w:r>
       <w:r>
-        <w:t xml:space="preserve">The progression decision (advance / hold / regress / refer) depends on a structured session history. Paper diaries are a demonstrably unreliable instrument for this: actual compliance with paper symptom diaries is far lower than reported compliance, and entries are commonly backfilled [16]. Serial HRt — the objective recovery curve — has to date been captured mainly within research protocols [9,10].</w:t>
+        <w:t xml:space="preserve">The progression decision (advance / hold / regress / refer) depends on a structured session history. Paper diaries are a demonstrably unreliable instrument in analogous self-report settings: actual compliance with paper symptom diaries is far lower than reported compliance, and entries are commonly backfilled [17]. Serial HRt — the objective recovery curve — has to date been captured mainly within research protocols [10,11].</w:t>
       </w:r>
     </w:p>
     <w:p>
@@ -1035,7 +1035,7 @@
         <w:pStyle w:val="FirstParagraph"/>
       </w:pPr>
       <w:r>
-        <w:t xml:space="preserve">The implementation gap defines a set of requirements for delivery that is faithful to the trialled protocol. They are proposed here by the author, informed by the trial procedures [8–10], the gap analysis in Section 3, and software-safety considerations, and stated at the level of requirements, independent of any vendor or product; Section 4.2 then locates the existing tools — including, with disclosed interest, the author’s — against them. The portable, repeatable prescription of Sections 2.4 and 2.5 is exactly what a guided tool could carry between visits, provided it carries it faithfully. The argument is deliberately modest: the physiology is not new; what the field lacks is faithful, verifiable, monitored delivery between visits.</w:t>
+        <w:t xml:space="preserve">The implementation gap defines a set of requirements for delivery that is faithful to the trialled protocol. They are proposed here by the author, informed by the trial procedures [9–11], the gap analysis in Section 3, and software-safety considerations, and stated at the level of requirements, independent of any vendor or product; Section 4.2 then locates the existing tools — including, with disclosed interest, the author’s — against them. The portable, repeatable prescription of Sections 2.4 and 2.5 is exactly what a guided tool could carry between visits, provided it carries it faithfully. The argument is deliberately modest: the physiology is not new; what the field lacks is faithful, verifiable, monitored delivery between visits.</w:t>
       </w:r>
     </w:p>
     <w:p>
@@ -1056,7 +1056,7 @@
         <w:t xml:space="preserve"> </w:t>
       </w:r>
       <w:r>
-        <w:t xml:space="preserve">A continuous heart-rate read, shown against the prescribed band in real time — the trials themselves delivered the band on a worn heart-rate monitor [9,10] — converts an abstract bpm range into a moment-to-moment</w:t>
+        <w:t xml:space="preserve">A continuous heart-rate read, shown against the prescribed band in real time — the trials themselves delivered the band on a worn heart-rate monitor [10,11] — converts an abstract bpm range into a moment-to-moment</w:t>
       </w:r>
       <w:r>
         <w:t xml:space="preserve"> </w:t>
@@ -1089,7 +1089,7 @@
         <w:t xml:space="preserve"> </w:t>
       </w:r>
       <w:r>
-        <w:t xml:space="preserve">Friction is a major threat to adherence. A tool should accept any wearable that broadcasts the standard Bluetooth Heart Rate profile — chest straps and most sports watches — and should fall back to clinician manual entry, meeting the patient where they are rather than mandating a purchase. Heart rate is the load-bearing measurement; sourcing it must never be the blocker. Two limits attach to any implementation: phone-camera photoplethysmography is unreliable during exercise because of motion artefact, so it should never drive a live training session; and some widely owned wrist devices do not broadcast the standard Bluetooth Heart Rate profile, so those users need a chest strap or manual entry.</w:t>
+        <w:t xml:space="preserve">Friction is a major threat to adherence. A tool should accept any wearable that broadcasts the standard Bluetooth Heart Rate profile — chest straps and most sports watches — and should fall back to clinician manual entry, meeting the patient where they are rather than mandating a purchase. Heart rate is the load-bearing measurement; sourcing it must never be the blocker. Two limits attach to any implementation: optical heart-rate measurement degrades with motion — smartphone-camera apps show variable accuracy [18] and wrist-worn optical sensors are least accurate during aerobic exercise [19] — so a phone-camera estimate should never drive a live training session; and some widely owned wrist devices do not broadcast the standard Bluetooth Heart Rate profile, so those users need a chest strap or manual entry.</w:t>
       </w:r>
     </w:p>
     <w:p>
@@ -1266,7 +1266,7 @@
         </w:numPr>
       </w:pPr>
       <w:r>
-        <w:t xml:space="preserve">A concussion rehabilitation app (Rhea Health, a University of Toronto spin-out) already delivers heart-rate-targeted aerobic prescription [17]. Its published protocol, however, guides users to a fixed ~60% ± 5% of age-predicted maximal heart rate (220 − age), with no graded test to individualise the threshold; individualisation is limited to in-app same/better/worse symptom feedback [18]. The published descriptions do not report a dedicated clinician dashboard [17,18]. An RCT from the same group has likewise delivered early aerobic exercise using a progressive percentage of age-predicted maximal heart rate [19]. (Neither Rhea nor the author’s product is affiliated with the Buffalo group.)</w:t>
+        <w:t xml:space="preserve">A concussion rehabilitation app (Rhea Health, a University of Toronto spin-out) already delivers heart-rate-targeted aerobic prescription [20]. Its published protocol, however, guides users to a fixed ~60% ± 5% of age-predicted maximal heart rate (220 − age), with no graded test to individualise the threshold; individualisation is limited to in-app same/better/worse symptom feedback [21]. The published descriptions do not report a dedicated clinician dashboard [20,21]. An RCT from the same group has likewise delivered early aerobic exercise using a progressive percentage of age-predicted maximal heart rate [22]. (Neither Rhea nor the author’s product is affiliated with the Buffalo group.)</w:t>
       </w:r>
     </w:p>
     <w:p>
@@ -1278,7 +1278,7 @@
         </w:numPr>
       </w:pPr>
       <w:r>
-        <w:t xml:space="preserve">Between-visit mobile-health symptom monitoring with structured return of data to clinicians is published [20].</w:t>
+        <w:t xml:space="preserve">Between-visit mobile-health symptom monitoring with structured return of data to clinicians is published [23].</w:t>
       </w:r>
     </w:p>
     <w:p>
@@ -1290,7 +1290,7 @@
         </w:numPr>
       </w:pPr>
       <w:r>
-        <w:t xml:space="preserve">The pivotal Buffalo trials themselves delivered individualised HRt-based home exercise with wearable heart-rate monitoring — 80% of HRt with a home heart-rate monitor [9], and a serial-HRt-updated prescription with weekly BCTT recheck [10]. The Buffalo programme, however, is a research protocol; this review’s mapping identified no commercial implementation of it apart from the author’s disclosed attempt described below, and the measured-threshold approach is not proprietary to any group.</w:t>
+        <w:t xml:space="preserve">The pivotal Buffalo trials themselves delivered individualised HRt-based home exercise with wearable heart-rate monitoring — 80% of HRt with a home heart-rate monitor [10], and a serial-HRt-updated prescription with weekly BCTT recheck [11]. The Buffalo programme, however, is a research protocol; this review’s mapping identified no commercial implementation of it apart from the author’s disclosed attempt described below, and the measured-threshold approach is not proprietary to any group.</w:t>
       </w:r>
     </w:p>
     <w:p>
@@ -1302,7 +1302,7 @@
         </w:numPr>
       </w:pPr>
       <w:r>
-        <w:t xml:space="preserve">A commercial concussion exercise-prescription module exists and is reaching Australia: the Complete Concussion Management Inc. (CCMI) and Wibbi partnership (announced December 2025) embeds concussion protocols in a digital home-exercise-programme platform with outcome tracking [21]. The published description reports symptom and outcome-score tracking; it does not describe digital delivery of a serial measured-HRt curve [21].</w:t>
+        <w:t xml:space="preserve">A commercial concussion exercise-prescription module exists and is reaching Australia: the Complete Concussion Management Inc. (CCMI) and Wibbi partnership (announced December 2025) embeds concussion protocols in a digital home-exercise-programme platform with outcome tracking [24]. The published description reports symptom and outcome-score tracking; it does not describe digital delivery of a serial measured-HRt curve [24].</w:t>
       </w:r>
     </w:p>
     <w:p>
@@ -1330,7 +1330,7 @@
         <w:t xml:space="preserve"> </w:t>
       </w:r>
       <w:r>
-        <w:t xml:space="preserve">platforms (e.g. Sway [22]) digitise symptom, balance and cognitive testing; their published descriptions include no exertion- or heart-rate-guided therapy. Supervised heart-rate-zone training is a familiar pattern in app-based cardiac rehabilitation; this review’s mapping identified no equivalently supervised, at-scale commercial implementation for concussion.</w:t>
+        <w:t xml:space="preserve">platforms (e.g. Sway [25]) digitise symptom, balance and cognitive testing; their published descriptions include no exertion- or heart-rate-guided therapy. Supervised heart-rate-zone training is a familiar pattern in app-based cardiac rehabilitation [26]; this review’s mapping identified no equivalently supervised, at-scale commercial implementation for concussion.</w:t>
       </w:r>
     </w:p>
     <w:p>
@@ -1395,7 +1395,7 @@
         <w:t xml:space="preserve"> </w:t>
       </w:r>
       <w:r>
-        <w:t xml:space="preserve">in one clinician-supervised workflow. The closest comparators each lack at least one element: the Rhea protocol uses a fixed percentage of age-predicted maximal heart rate with no graded test and no reported clinician dashboard [17,18]; the CCMI–Wibbi module’s published description reports outcome-score tracking rather than a serial measured-HRt curve [21]. Each element exists somewhere in the prior art; the observation concerns their combination — and it is made against criteria the author framed, so the disclosed interest applies to the comparison as much as to the product.</w:t>
+        <w:t xml:space="preserve">in one clinician-supervised workflow. The closest comparators each lack at least one element: the Rhea protocol uses a fixed percentage of age-predicted maximal heart rate with no graded test and no reported clinician dashboard [20,21]; the CCMI–Wibbi module’s published description reports outcome-score tracking rather than a serial measured-HRt curve [24]. Each element exists somewhere in the prior art; the observation concerns their combination — and it is made against criteria the author framed, so the disclosed interest applies to the comparison as much as to the product.</w:t>
       </w:r>
     </w:p>
     <w:p>
@@ -1422,7 +1422,7 @@
         <w:pStyle w:val="FirstParagraph"/>
       </w:pPr>
       <w:r>
-        <w:t xml:space="preserve">The strongest randomised evidence for SSTAE is in adolescents with sport-related concussion in the early window; the adult and persistent-symptom evidence, while supportive, is thinner and calls for better trials [13]. A digital delivery tool inherits this evidence base — it can make faithful delivery of an evidence-based prescription easier and more measurable, but it does not, by itself, constitute new efficacy evidence. The defensible claim for such software is verification-by-design and faithful delivery, not a new clinical outcome. A retrospective, observational analysis of de-identified routine-care data (serial HRt trajectories, adherence, time-to-clearance) accumulated through normal clinical use is the appropriate first step towards outcome evidence; an efficacy claim would additionally require prospective controlled evaluation.</w:t>
+        <w:t xml:space="preserve">The strongest randomised evidence for SSTAE is in adolescents with sport-related concussion in the early window; the adult and persistent-symptom evidence, while supportive, is thinner and calls for better trials [14]. A digital delivery tool inherits this evidence base — it can make faithful delivery of an evidence-based prescription easier and more measurable, but it does not, by itself, constitute new efficacy evidence. The defensible claim for such software is verification-by-design and faithful delivery, not a new clinical outcome. A retrospective, observational analysis of de-identified routine-care data (serial HRt trajectories, adherence, time-to-clearance) accumulated through normal clinical use is the appropriate first step towards outcome evidence; an efficacy claim would additionally require prospective controlled evaluation.</w:t>
       </w:r>
     </w:p>
     <w:p>
@@ -1430,7 +1430,7 @@
         <w:pStyle w:val="BodyText"/>
       </w:pPr>
       <w:r>
-        <w:t xml:space="preserve">Digital delivery is also not a free good, and the case for it should not be made one-sidedly. Whether a wearable-guided app actually improves between-visit delivery is itself an empirical question, not a given: app-based adherence commonly decays over weeks; live heart-rate feedback can be misread under exertion or anxiety; consumer optical sensors are least accurate at exactly the exercising heart rates that matter; and any tool introduces equity and access concerns — the cost of a wearable, smartphone and data, and a digital-literacy and language barrier that can widen rather than narrow disparities in who receives faithful rehabilitation. Privacy and data-governance obligations attach to any between-visit clinical data flow. These are the reasons the contribution is framed as verification-by-design and a measurable delivery substrate — and why its real-world value, like its efficacy, is deferred to evaluation rather than asserted.</w:t>
+        <w:t xml:space="preserve">Digital delivery is also not a free good, and the case for it should not be made one-sidedly. Whether a wearable-guided app actually improves between-visit delivery is itself an empirical question, not a given: app-based adherence commonly decays over weeks [27]; live heart-rate feedback can be misread under exertion or anxiety; consumer optical sensors are least accurate at exactly the exercising heart rates that matter [19]; and any tool introduces equity and access concerns — the cost of a wearable, smartphone and data, and a digital-literacy and language barrier that can widen rather than narrow disparities in who receives faithful rehabilitation. Privacy and data-governance obligations attach to any between-visit clinical data flow. These are the reasons the contribution is framed as verification-by-design and a measurable delivery substrate — and why its real-world value, like its efficacy, is deferred to evaluation rather than asserted.</w:t>
       </w:r>
     </w:p>
     <w:p>
@@ -1484,7 +1484,7 @@
         <w:t xml:space="preserve"> </w:t>
       </w:r>
       <w:r>
-        <w:t xml:space="preserve">The author (ZL) is the developer and founder of the SST Trainer software and of Concussion Education Australia, which is referenced in Section 4.2 as one disclosed instance of the delivery requirements discussed. No other competing interests are declared. The steps taken to mitigate this interest are described in the Methods.</w:t>
+        <w:t xml:space="preserve">The author (ZL) is the founder of Concussion Education Australia and the developer of the SST Trainer software, which is referenced in Section 4.2 as one disclosed instance of the delivery requirements discussed. No other competing interests are declared. The steps taken to mitigate this interest are described in the Methods.</w:t>
       </w:r>
     </w:p>
     <w:p>
@@ -1578,6 +1578,34 @@
         </w:numPr>
       </w:pPr>
       <w:r>
+        <w:t xml:space="preserve">Thomas DG, Apps JN, Hoffmann RG, McCrea M, Hammeke T. Benefits of strict rest after acute concussion: a randomized controlled trial.</w:t>
+      </w:r>
+      <w:r>
+        <w:t xml:space="preserve"> </w:t>
+      </w:r>
+      <w:r>
+        <w:rPr>
+          <w:i/>
+          <w:iCs/>
+        </w:rPr>
+        <w:t xml:space="preserve">Pediatrics.</w:t>
+      </w:r>
+      <w:r>
+        <w:t xml:space="preserve"> </w:t>
+      </w:r>
+      <w:r>
+        <w:t xml:space="preserve">2015;135(2):213–223. doi:10.1542/peds.2014-0966</w:t>
+      </w:r>
+    </w:p>
+    <w:p>
+      <w:pPr>
+        <w:pStyle w:val="Compact"/>
+        <w:numPr>
+          <w:ilvl w:val="0"/>
+          <w:numId w:val="1008"/>
+        </w:numPr>
+      </w:pPr>
+      <w:r>
         <w:t xml:space="preserve">Leddy JJ, Haider MN, Ellis M, Willer BS. Exercise is Medicine for Concussion.</w:t>
       </w:r>
       <w:r>
@@ -2026,6 +2054,62 @@
         </w:numPr>
       </w:pPr>
       <w:r>
+        <w:t xml:space="preserve">Coppetti T, Brauchlin A, Müggler S, et al. Accuracy of smartphone apps for heart rate measurement.</w:t>
+      </w:r>
+      <w:r>
+        <w:t xml:space="preserve"> </w:t>
+      </w:r>
+      <w:r>
+        <w:rPr>
+          <w:i/>
+          <w:iCs/>
+        </w:rPr>
+        <w:t xml:space="preserve">Eur J Prev Cardiol.</w:t>
+      </w:r>
+      <w:r>
+        <w:t xml:space="preserve"> </w:t>
+      </w:r>
+      <w:r>
+        <w:t xml:space="preserve">2017;24(12):1287–1293. doi:10.1177/2047487317702044</w:t>
+      </w:r>
+    </w:p>
+    <w:p>
+      <w:pPr>
+        <w:pStyle w:val="Compact"/>
+        <w:numPr>
+          <w:ilvl w:val="0"/>
+          <w:numId w:val="1008"/>
+        </w:numPr>
+      </w:pPr>
+      <w:r>
+        <w:t xml:space="preserve">Gillinov S, Etiwy M, Wang R, et al. Variable accuracy of wearable heart rate monitors during aerobic exercise.</w:t>
+      </w:r>
+      <w:r>
+        <w:t xml:space="preserve"> </w:t>
+      </w:r>
+      <w:r>
+        <w:rPr>
+          <w:i/>
+          <w:iCs/>
+        </w:rPr>
+        <w:t xml:space="preserve">Med Sci Sports Exerc.</w:t>
+      </w:r>
+      <w:r>
+        <w:t xml:space="preserve"> </w:t>
+      </w:r>
+      <w:r>
+        <w:t xml:space="preserve">2017;49(8):1697–1703. doi:10.1249/MSS.0000000000001284</w:t>
+      </w:r>
+    </w:p>
+    <w:p>
+      <w:pPr>
+        <w:pStyle w:val="Compact"/>
+        <w:numPr>
+          <w:ilvl w:val="0"/>
+          <w:numId w:val="1008"/>
+        </w:numPr>
+      </w:pPr>
+      <w:r>
         <w:t xml:space="preserve">Hutchison MG, Di Battista AP, Pyndiura KL. Evaluating User Experience and Satisfaction in a Concussion Rehabilitation App: Usability Study.</w:t>
       </w:r>
       <w:r>
@@ -2151,6 +2235,62 @@
       </w:pPr>
       <w:r>
         <w:t xml:space="preserve">US Food and Drug Administration. 510(k) premarket notification K241737 (Sway Medical, Inc.). Decision date February 2025. https://www.accessdata.fda.gov/scripts/cdrh/cfdocs/cfpmn/pmn.cfm?ID=K241737 (accessed 12 August 2026).</w:t>
+      </w:r>
+    </w:p>
+    <w:p>
+      <w:pPr>
+        <w:pStyle w:val="Compact"/>
+        <w:numPr>
+          <w:ilvl w:val="0"/>
+          <w:numId w:val="1008"/>
+        </w:numPr>
+      </w:pPr>
+      <w:r>
+        <w:t xml:space="preserve">Varnfield M, Karunanithi M, Lee CK, et al. Smartphone-based home care model improved use of cardiac rehabilitation in postmyocardial infarction patients: results from a randomised controlled trial.</w:t>
+      </w:r>
+      <w:r>
+        <w:t xml:space="preserve"> </w:t>
+      </w:r>
+      <w:r>
+        <w:rPr>
+          <w:i/>
+          <w:iCs/>
+        </w:rPr>
+        <w:t xml:space="preserve">Heart.</w:t>
+      </w:r>
+      <w:r>
+        <w:t xml:space="preserve"> </w:t>
+      </w:r>
+      <w:r>
+        <w:t xml:space="preserve">2014;100(22):1770–1779. doi:10.1136/heartjnl-2014-305783</w:t>
+      </w:r>
+    </w:p>
+    <w:p>
+      <w:pPr>
+        <w:pStyle w:val="Compact"/>
+        <w:numPr>
+          <w:ilvl w:val="0"/>
+          <w:numId w:val="1008"/>
+        </w:numPr>
+      </w:pPr>
+      <w:r>
+        <w:t xml:space="preserve">Eysenbach G. The law of attrition.</w:t>
+      </w:r>
+      <w:r>
+        <w:t xml:space="preserve"> </w:t>
+      </w:r>
+      <w:r>
+        <w:rPr>
+          <w:i/>
+          <w:iCs/>
+        </w:rPr>
+        <w:t xml:space="preserve">J Med Internet Res.</w:t>
+      </w:r>
+      <w:r>
+        <w:t xml:space="preserve"> </w:t>
+      </w:r>
+      <w:r>
+        <w:t xml:space="preserve">2005;7(1):e11. doi:10.2196/jmir.7.1.e11</w:t>
       </w:r>
     </w:p>
     <w:bookmarkEnd w:id="29"/>

</xml_diff>

<commit_message>
Paper 1: Wibbi characterisation matched to its source verbatim; Australia claim cut
The cited partnership page says real-time outcome monitoring and progress
tracking, mentions no symptom tracking, no scores, and no Australia rollout
(fetched and read). Late round-7 fact-check findings.

Co-Authored-By: Claude Fable 5 <noreply@anthropic.com>
</commit_message>
<xml_diff>
--- a/docs/sst-publications/01-clinical-review-SUBMISSION.docx
+++ b/docs/sst-publications/01-clinical-review-SUBMISSION.docx
@@ -1302,7 +1302,7 @@
         </w:numPr>
       </w:pPr>
       <w:r>
-        <w:t xml:space="preserve">A commercial concussion exercise-prescription module exists and is reaching Australia: the Complete Concussion Management Inc. (CCMI) and Wibbi partnership (announced December 2025) embeds concussion protocols in a digital home-exercise-programme platform with outcome tracking [24]. The published description reports symptom and outcome-score tracking; it does not describe digital delivery of a serial measured-HRt curve [24].</w:t>
+        <w:t xml:space="preserve">A commercial concussion exercise-prescription module exists: the Complete Concussion Management Inc. (CCMI) and Wibbi partnership (announced December 2025) embeds concussion protocols in a digital home-exercise-programme platform with outcome tracking [24]. The published description reports real-time outcome tracking and progress monitoring; it does not describe digital delivery of a serial measured-HRt curve [24].</w:t>
       </w:r>
     </w:p>
     <w:p>
@@ -1395,7 +1395,7 @@
         <w:t xml:space="preserve"> </w:t>
       </w:r>
       <w:r>
-        <w:t xml:space="preserve">in one clinician-supervised workflow. The closest comparators each lack at least one element: the Rhea protocol uses a fixed percentage of age-predicted maximal heart rate with no graded test and no reported clinician dashboard [20,21]; the CCMI–Wibbi module’s published description reports outcome-score tracking rather than a serial measured-HRt curve [24]. Each element exists somewhere in the prior art; the observation concerns their combination — and it is made against criteria the author framed, so the disclosed interest applies to the comparison as much as to the product.</w:t>
+        <w:t xml:space="preserve">in one clinician-supervised workflow. The closest comparators each lack at least one element: the Rhea protocol uses a fixed percentage of age-predicted maximal heart rate with no graded test and no reported clinician dashboard [20,21]; the CCMI–Wibbi module’s published description reports outcome tracking rather than a serial measured-HRt curve [24]. Each element exists somewhere in the prior art; the observation concerns their combination — and it is made against criteria the author framed, so the disclosed interest applies to the comparison as much as to the product.</w:t>
       </w:r>
     </w:p>
     <w:p>

</xml_diff>

<commit_message>
Paper 1 ninth review round: two of three clean; final hardening applied
Round 9: hostile NO REQUIRED DEFECTS (accept-shaped; every challenged stat
source-verified and held), fact-check NO REQUIRED DEFECTS (FDA URL confirmed
200 via curl; all 27 refs and order verified), copy-edit one duplication
introduced by the round-8 fix (removed in-round).
Hardening: Rhea dashboard claim narrowed to the cited evaluations (a public
HEADCHECK-Rhea partnership exists); Gillinov glosses tightened to what the
abstract states (less-accurate, no intensity-gradient claim); pacing apps
typically; Wibbi duplication removed.

Co-Authored-By: Claude Fable 5 <noreply@anthropic.com>
</commit_message>
<xml_diff>
--- a/docs/sst-publications/01-clinical-review-SUBMISSION.docx
+++ b/docs/sst-publications/01-clinical-review-SUBMISSION.docx
@@ -1089,7 +1089,7 @@
         <w:t xml:space="preserve"> </w:t>
       </w:r>
       <w:r>
-        <w:t xml:space="preserve">Friction is a major threat to adherence. A tool should accept any wearable that broadcasts the standard Bluetooth Heart Rate profile — chest straps and most sports watches — and should fall back to clinician manual entry, meeting the patient where they are rather than mandating a purchase. Heart rate is the load-bearing measurement; sourcing it must never be the blocker. Two limits attach to any implementation: optical heart-rate measurement degrades with motion — smartphone-camera apps show variable accuracy [18] and wrist-worn optical sensors are least accurate during aerobic exercise [19] — so a phone-camera estimate should never drive a live training session; and some widely owned wrist devices do not broadcast the standard Bluetooth Heart Rate profile, so those users need a chest strap or manual entry.</w:t>
+        <w:t xml:space="preserve">Friction is a major threat to adherence. A tool should accept any wearable that broadcasts the standard Bluetooth Heart Rate profile — chest straps and most sports watches — and should fall back to clinician manual entry, meeting the patient where they are rather than mandating a purchase. Heart rate is the load-bearing measurement; sourcing it must never be the blocker. Two limits attach to any implementation: optical heart-rate measurement degrades with motion — smartphone-camera apps show variable accuracy [18] and wrist-worn optical sensors are measurably less accurate during aerobic exercise [19] — so a phone-camera estimate should never drive a live training session; and some widely owned wrist devices do not broadcast the standard Bluetooth Heart Rate profile, so those users need a chest strap or manual entry.</w:t>
       </w:r>
     </w:p>
     <w:p>
@@ -1220,7 +1220,7 @@
         <w:pStyle w:val="FirstParagraph"/>
       </w:pPr>
       <w:r>
-        <w:t xml:space="preserve">It is worth distinguishing this from the better-known consumer category. Pacing apps for ME/CFS and long COVID are built to help users</w:t>
+        <w:t xml:space="preserve">It is worth distinguishing this from the better-known consumer category. Pacing apps for ME/CFS and long COVID are typically built to help users</w:t>
       </w:r>
       <w:r>
         <w:t xml:space="preserve"> </w:t>
@@ -1266,7 +1266,7 @@
         </w:numPr>
       </w:pPr>
       <w:r>
-        <w:t xml:space="preserve">A concussion rehabilitation app (Rhea Health, a University of Toronto spin-out) already delivers heart-rate-targeted aerobic prescription [20]. Its published protocol, however, guides users to a fixed ~60% ± 5% of age-predicted maximal heart rate (220 − age), with no graded test to individualise the threshold; individualisation is limited to in-app same/better/worse symptom feedback [21]. The published descriptions do not report a dedicated clinician dashboard [20,21]. An RCT from the same group has likewise delivered early aerobic exercise using a progressive percentage of age-predicted maximal heart rate [22]. (Neither Rhea nor the author’s product is affiliated with the Buffalo group.)</w:t>
+        <w:t xml:space="preserve">A concussion rehabilitation app (Rhea Health, a University of Toronto spin-out) already delivers heart-rate-targeted aerobic prescription [20]. Its published protocol, however, guides users to a fixed ~60% ± 5% of age-predicted maximal heart rate (220 − age), with no graded test to individualise the threshold; individualisation is limited to in-app same/better/worse symptom feedback [21]. The cited evaluations do not report a dedicated clinician dashboard [20,21]. An RCT from the same group has likewise delivered early aerobic exercise using a progressive percentage of age-predicted maximal heart rate [22]. (Neither Rhea nor the author’s product is affiliated with the Buffalo group.)</w:t>
       </w:r>
     </w:p>
     <w:p>
@@ -1302,7 +1302,7 @@
         </w:numPr>
       </w:pPr>
       <w:r>
-        <w:t xml:space="preserve">A commercial concussion exercise-prescription module exists: the Complete Concussion Management Inc. (CCMI) and Wibbi partnership (announced December 2025) embeds concussion protocols in a digital home-exercise-programme platform with real-time outcome monitoring and progress tracking [24]. The published description reports real-time outcome monitoring and progress tracking; it does not describe digital delivery of a serial measured-HRt curve [24].</w:t>
+        <w:t xml:space="preserve">A commercial concussion exercise-prescription module exists: the Complete Concussion Management Inc. (CCMI) and Wibbi partnership (announced December 2025) embeds concussion protocols in a digital home-exercise-programme platform with real-time outcome monitoring and progress tracking [24]. The published description does not, however, describe digital delivery of a serial measured-HRt curve [24].</w:t>
       </w:r>
     </w:p>
     <w:p>
@@ -1430,7 +1430,7 @@
         <w:pStyle w:val="BodyText"/>
       </w:pPr>
       <w:r>
-        <w:t xml:space="preserve">Digital delivery is also not a free good, and the case for it should not be made one-sidedly. Whether a wearable-guided app actually improves between-visit delivery is itself an empirical question, not a given: app-based adherence commonly decays over weeks [27]; live heart-rate feedback can be misread under exertion or anxiety; consumer optical sensors are least accurate at exactly the exercising heart rates that matter [19]; and any tool introduces equity and access concerns — the cost of a wearable, smartphone and data, and a digital-literacy and language barrier that can widen rather than narrow disparities in who receives faithful rehabilitation. Privacy and data-governance obligations attach to any between-visit clinical data flow. These are the reasons the contribution is framed as verification-by-design and a measurable delivery substrate — and why its real-world value, like its efficacy, is deferred to evaluation rather than asserted.</w:t>
+        <w:t xml:space="preserve">Digital delivery is also not a free good, and the case for it should not be made one-sidedly. Whether a wearable-guided app actually improves between-visit delivery is itself an empirical question, not a given: app-based adherence commonly decays over weeks [27]; live heart-rate feedback can be misread under exertion or anxiety; consumer optical sensors are less accurate during exercise — exactly when the measurement matters [19]; and any tool introduces equity and access concerns — the cost of a wearable, smartphone and data, and a digital-literacy and language barrier that can widen rather than narrow disparities in who receives faithful rehabilitation. Privacy and data-governance obligations attach to any between-visit clinical data flow. These are the reasons the contribution is framed as verification-by-design and a measurable delivery substrate — and why its real-world value, like its efficacy, is deferred to evaluation rather than asserted.</w:t>
       </w:r>
     </w:p>
     <w:p>

</xml_diff>

<commit_message>
Paper 1: live BMJ OSEM page reconciled - PPI/EDI statements, SMA discount, APC corrected
Zac pasted the live authors page (the spot-check the pack asked for). All
prior compliance items confirmed verbatim. Deltas applied:
- PPI + EDI statements added to Methods (live page requests both);
  offsetting trims keep main text at 3,995 words excl table
- Title matches their exact required string: a Narrative review (all 3 docs)
- APC corrected to GBP 2,460 + VAT; Zac qualifies for the 15% affiliation
  discount (Sports Medicine Australia is listed; he is SMA member 179899)
- Pack marks the SportRxiv preprint OPTIONAL with the decision framing
  (only purpose = citable DOI during review months)

Co-Authored-By: Claude Fable 5 <noreply@anthropic.com>
</commit_message>
<xml_diff>
--- a/docs/sst-publications/01-clinical-review-SUBMISSION.docx
+++ b/docs/sst-publications/01-clinical-review-SUBMISSION.docx
@@ -8,7 +8,7 @@
         <w:pStyle w:val="Heading1"/>
       </w:pPr>
       <w:r>
-        <w:t xml:space="preserve">Sub-symptom-threshold aerobic exercise for concussion: from the Buffalo test to digital, clinician-supervised delivery — a narrative review</w:t>
+        <w:t xml:space="preserve">Sub-symptom-threshold aerobic exercise for concussion: from the Buffalo test to digital, clinician-supervised delivery — a Narrative review</w:t>
       </w:r>
     </w:p>
     <w:p>
@@ -300,6 +300,42 @@
           <w:b/>
           <w:bCs/>
         </w:rPr>
+        <w:t xml:space="preserve">Patient and public involvement.</w:t>
+      </w:r>
+      <w:r>
+        <w:t xml:space="preserve"> </w:t>
+      </w:r>
+      <w:r>
+        <w:t xml:space="preserve">Patients and the public were not involved in this review of published literature.</w:t>
+      </w:r>
+    </w:p>
+    <w:p>
+      <w:pPr>
+        <w:pStyle w:val="BodyText"/>
+      </w:pPr>
+      <w:r>
+        <w:rPr>
+          <w:b/>
+          <w:bCs/>
+        </w:rPr>
+        <w:t xml:space="preserve">Equity, diversity and inclusion.</w:t>
+      </w:r>
+      <w:r>
+        <w:t xml:space="preserve"> </w:t>
+      </w:r>
+      <w:r>
+        <w:t xml:space="preserve">The author is a single clinician; the reviewed evidence skews adolescent, sport-related and high-income, and the equity limits of digital delivery are addressed in Section 5.</w:t>
+      </w:r>
+    </w:p>
+    <w:p>
+      <w:pPr>
+        <w:pStyle w:val="BodyText"/>
+      </w:pPr>
+      <w:r>
+        <w:rPr>
+          <w:b/>
+          <w:bCs/>
+        </w:rPr>
         <w:t xml:space="preserve">Conflict of interest and its mitigation.</w:t>
       </w:r>
       <w:r>
@@ -358,7 +394,7 @@
         <w:t xml:space="preserve">“cocoon therapy”</w:t>
       </w:r>
       <w:r>
-        <w:t xml:space="preserve">. The intuition was mechanical: an injured brain should be protected from load. But prolonged rest has costs. Deconditioning, sleep disruption, mood disturbance, social isolation and nocebo-style symptom focus all compound the original injury, and there was never randomised evidence that strict rest shortened recovery; a randomised trial of strict rest found a higher symptom burden and slower symptom resolution than usual care [1], and in a prospective cohort of 3,063 children and adolescents, physical activity within seven days of injury was associated with a significantly lower risk of persistent symptoms at 28 days than no activity (unadjusted 24.6% vs 43.5%; propensity-adjusted absolute risk difference 11.4%) [2]. By the mid-2010s, the rest prescription was being actively questioned.</w:t>
+        <w:t xml:space="preserve">. But prolonged rest has costs. Deconditioning, sleep disruption, mood disturbance, social isolation and nocebo-style symptom focus all compound the original injury, and there was never randomised evidence that strict rest shortened recovery; a randomised trial of strict rest found a higher symptom burden and slower symptom resolution than usual care [1], and in a prospective cohort of 3,063 children and adolescents, physical activity within seven days of injury was associated with a significantly lower risk of persistent symptoms at 28 days than no activity (unadjusted 24.6% vs 43.5%; propensity-adjusted absolute risk difference 11.4%) [2].</w:t>
       </w:r>
     </w:p>
     <w:p>
@@ -382,7 +418,7 @@
         <w:t xml:space="preserve"> </w:t>
       </w:r>
       <w:r>
-        <w:t xml:space="preserve">[3]. The argument is that a meaningful proportion of post-concussion symptom burden reflects not structural injury but a disorder of physiological regulation — autonomic and cerebrovascular dysregulation that is provoked by exertion and, crucially, is responsive to a graded aerobic stimulus delivered below the provocation threshold. Exercise, correctly dosed, is not a risk to be avoided; it is the treatment.</w:t>
+        <w:t xml:space="preserve">[3]. The argument is that a meaningful proportion of post-concussion symptom burden reflects not structural injury but a disorder of physiological regulation — autonomic and cerebrovascular dysregulation that is provoked by exertion and, crucially, is responsive to a graded aerobic stimulus delivered below the provocation threshold. Correctly dosed, exercise is the treatment, not a risk.</w:t>
       </w:r>
     </w:p>
     <w:bookmarkEnd w:id="12"/>
@@ -1418,7 +1454,7 @@
         <w:pStyle w:val="FirstParagraph"/>
       </w:pPr>
       <w:r>
-        <w:t xml:space="preserve">Here is the problem the evidence does not solve. The trials prescribed an individualised heart-rate ceiling and reported good adherence under clinician oversight [14,15]. In routine practice, three things break:</w:t>
+        <w:t xml:space="preserve">The trials prescribed an individualised heart-rate ceiling and reported good adherence under clinician oversight [14,15]. In routine practice, three things break:</w:t>
       </w:r>
     </w:p>
     <w:p>
@@ -1534,7 +1570,7 @@
         <w:pStyle w:val="FirstParagraph"/>
       </w:pPr>
       <w:r>
-        <w:t xml:space="preserve">The implementation gap defines a set of requirements for delivery that is faithful to the trialled protocol. They are proposed here by the author, informed by the trial procedures [13–15], the gap analysis in Section 3, and software-safety considerations, and stated at the level of requirements, independent of any vendor or product; Section 4.2 then locates the existing tools — including, with disclosed interest, the author’s — against them. The argument is deliberately modest: the physiology is not new; what the field lacks is faithful, verifiable, monitored delivery between visits.</w:t>
+        <w:t xml:space="preserve">The implementation gap defines a set of requirements for delivery that is faithful to the trialled protocol. They are proposed here by the author, informed by the trial procedures [13–15], the gap analysis in Section 3, and software-safety considerations, and stated as requirements independent of any vendor or product; Section 4.2 then locates the existing tools — including, with disclosed interest, the author’s — against them. The argument is deliberately modest: the physiology is not new; what the field lacks is faithful, verifiable, monitored delivery between visits.</w:t>
       </w:r>
     </w:p>
     <w:p>
@@ -1929,7 +1965,7 @@
         <w:pStyle w:val="BodyText"/>
       </w:pPr>
       <w:r>
-        <w:t xml:space="preserve">Nor is digital delivery a free good. Whether a wearable-guided app actually improves between-visit delivery is itself an empirical question, not a given: app-based adherence commonly decays over weeks [34]; live heart-rate feedback can be misread under exertion or anxiety; consumer optical sensors are less accurate during exercise [26]; and any tool raises equity concerns — wearable, smartphone and data costs, plus digital-literacy and language barriers that can widen disparities. Privacy and data-governance obligations attach to any between-visit clinical data flow. Hence the framing: verification-by-design and a measurable delivery substrate, with real-world value deferred to evaluation rather than asserted.</w:t>
+        <w:t xml:space="preserve">Whether a wearable-guided app actually improves between-visit delivery is itself an empirical question, not a given: app-based adherence commonly decays over weeks [34]; live heart-rate feedback can be misread under exertion or anxiety; consumer optical sensors are less accurate during exercise [26]; and any tool raises equity concerns — wearable, smartphone and data costs, plus digital-literacy and language barriers that can widen disparities. Privacy and data-governance obligations attach to any between-visit clinical data flow. Hence the framing: verification-by-design and a measurable delivery substrate, with real-world value deferred to evaluation rather than asserted.</w:t>
       </w:r>
     </w:p>
     <w:p>
@@ -1955,7 +1991,7 @@
         <w:pStyle w:val="FirstParagraph"/>
       </w:pPr>
       <w:r>
-        <w:t xml:space="preserve">Concussion management has completed a genuine paradigm shift: from rest-until-symptom-free to early, individualised, sub-symptom-threshold aerobic exercise, anchored to a measured heart-rate threshold and endorsed by the field’s consensus statement. The remaining problem is not what to prescribe but how to deliver it faithfully between visits, when the therapeutic ceiling is invisible, the sessions are unobserved, and the data needed to progress safely are the data that get lost. Tools that are clinician-prescribed, wearable-delivered, hardware-agnostic in how they read heart rate, strict in never fabricating that signal, and built to carry the safety logic and report back to the prescriber are candidate instruments for closing that gap. The contribution such tools offer is integration and faithful, verifiable delivery of an established treatment — not new physiology, and not, on their own, new outcome evidence. Whether they deliver that promise in practice — improving real-world delivery without widening disparities — is precisely the question the next phase of evaluation, set out above, must answer.</w:t>
+        <w:t xml:space="preserve">Concussion management has completed a genuine paradigm shift: from rest-until-symptom-free to early, individualised, sub-symptom-threshold aerobic exercise, anchored to a measured heart-rate threshold and endorsed by the field’s consensus statement. The remaining problem is not what to prescribe but how to deliver it faithfully between visits, when the therapeutic ceiling is invisible, the sessions are unobserved, and the data needed to progress safely are the data that get lost. Tools that are clinician-prescribed, wearable-delivered, hardware-agnostic in how they read heart rate, strict in never fabricating that signal, and built to carry the safety logic and report back to the prescriber are candidate instruments for closing that gap. The contribution such tools offer is integration and faithful, verifiable delivery of an established treatment — not new physiology, and not, on their own, new outcome evidence. Whether they deliver that promise in practice — improving real-world delivery without widening disparities — is the question the evaluation set out above must answer.</w:t>
       </w:r>
     </w:p>
     <w:bookmarkEnd w:id="27"/>

</xml_diff>

<commit_message>
Paper 1: running head + credentials into the manuscript header (single-file upload)
The checker was run on a stale docx; current file verified (org email, six-
column table). Running head and qualifications now live in the manuscript
itself, not only the title page. Affiliation address awaits Zac.

Co-Authored-By: Claude Fable 5 <noreply@anthropic.com>
</commit_message>
<xml_diff>
--- a/docs/sst-publications/01-clinical-review-SUBMISSION.docx
+++ b/docs/sst-publications/01-clinical-review-SUBMISSION.docx
@@ -20,7 +20,25 @@
           <w:b/>
           <w:bCs/>
         </w:rPr>
-        <w:t xml:space="preserve">Zac Lewis</w:t>
+        <w:t xml:space="preserve">Running head:</w:t>
+      </w:r>
+      <w:r>
+        <w:t xml:space="preserve"> </w:t>
+      </w:r>
+      <w:r>
+        <w:t xml:space="preserve">SSTAE for concussion: digital delivery</w:t>
+      </w:r>
+    </w:p>
+    <w:p>
+      <w:pPr>
+        <w:pStyle w:val="BodyText"/>
+      </w:pPr>
+      <w:r>
+        <w:rPr>
+          <w:b/>
+          <w:bCs/>
+        </w:rPr>
+        <w:t xml:space="preserve">Zac Lewis, B.Clin.Sci., M.Ost.Med.</w:t>
       </w:r>
       <w:r>
         <w:t xml:space="preserve">¹</w:t>

</xml_diff>

<commit_message>
Paper 1 finalised for BJSM: address in, letter retargeted, 5 MCQs drafted
Zac supplied address/phone/creds-confirm/email-confirm and delegated the
venue call. Decision: BJSM first (max reputation for scheme/accreditor
leverage, zero cost, fast desk decision), P&SM -> PTiS -> Brain Injury
cascade on rejection, DECLINE the paid BOSEM transfer.
- Affiliation: Byron Bay NSW in manuscript; full street address on title
  page + corresponding lines; phone on title page for the portal
- Title now 'a Narrative Review' (BJSM's exact string) across all docs
- Cover letter re-addressed to BJSM + notes the included MCQs
- 01-mcqs.md: five single-best-answer questions with answers, every stem
  grounded in manuscript sections (BCTT HRt definition, Amsterdam
  tolerance rule, Lancet 2021 result, dHR<=50 prognosis, ACTBI null)
- Pack step 2 rewritten for BJSM with the decline-the-transfer warning

Co-Authored-By: Claude Fable 5 <noreply@anthropic.com>
</commit_message>
<xml_diff>
--- a/docs/sst-publications/01-clinical-review-SUBMISSION.docx
+++ b/docs/sst-publications/01-clinical-review-SUBMISSION.docx
@@ -8,7 +8,7 @@
         <w:pStyle w:val="Heading1"/>
       </w:pPr>
       <w:r>
-        <w:t xml:space="preserve">Sub-symptom-threshold aerobic exercise for concussion: from the Buffalo test to digital, clinician-supervised delivery — a Narrative review</w:t>
+        <w:t xml:space="preserve">Sub-symptom-threshold aerobic exercise for concussion: from the Buffalo test to digital, clinician-supervised delivery — a Narrative Review</w:t>
       </w:r>
     </w:p>
     <w:p>
@@ -49,7 +49,7 @@
         <w:pStyle w:val="BodyText"/>
       </w:pPr>
       <w:r>
-        <w:t xml:space="preserve">¹ Concussion Education Australia, Australia. ORCID: 0009-0002-4267-0451.</w:t>
+        <w:t xml:space="preserve">¹ Concussion Education Australia, Byron Bay, NSW, Australia. ORCID: 0009-0002-4267-0451.</w:t>
       </w:r>
     </w:p>
     <w:p>
@@ -67,7 +67,7 @@
         <w:t xml:space="preserve"> </w:t>
       </w:r>
       <w:r>
-        <w:t xml:space="preserve">Zac Lewis, Concussion Education Australia. Email: zac@concussion-education-australia.com</w:t>
+        <w:t xml:space="preserve">Zac Lewis, Concussion Education Australia, 2 Wordsworth St, Byron Bay, NSW 2481, Australia. Email: zac@concussion-education-australia.com</w:t>
       </w:r>
     </w:p>
     <w:p>

</xml_diff>